<commit_message>
made the ui and the templates better
</commit_message>
<xml_diff>
--- a/vorlage_deutsch.docx
+++ b/vorlage_deutsch.docx
@@ -102,21 +102,8 @@
                 <w:sz w:val="48"/>
                 <w:szCs w:val="48"/>
               </w:rPr>
-              <w:t xml:space="preserve">L </w:t>
-            </w:r>
-            <w:proofErr w:type="spellStart"/>
-            <w:r>
-              <w:rPr>
-                <w:rFonts w:ascii="Source Sans Pro" w:hAnsi="Source Sans Pro" w:cs="Arial"/>
-                <w:b/>
-                <w:bCs/>
-                <w:spacing w:val="20"/>
-                <w:sz w:val="48"/>
-                <w:szCs w:val="48"/>
-              </w:rPr>
-              <w:t>L</w:t>
-            </w:r>
-            <w:proofErr w:type="spellEnd"/>
+              <w:t>L L</w:t>
+            </w:r>
           </w:p>
           <w:p>
             <w:pPr>
@@ -177,31 +164,7 @@
                 <w:szCs w:val="40"/>
                 <w:lang w:val="en-GB"/>
               </w:rPr>
-              <w:t>&lt;</w:t>
-            </w:r>
-            <w:proofErr w:type="spellStart"/>
-            <w:r>
-              <w:rPr>
-                <w:rFonts w:ascii="Source Sans Pro" w:hAnsi="Source Sans Pro"/>
-                <w:b/>
-                <w:bCs/>
-                <w:sz w:val="40"/>
-                <w:szCs w:val="40"/>
-                <w:lang w:val="en-GB"/>
-              </w:rPr>
-              <w:t>Überschrift</w:t>
-            </w:r>
-            <w:proofErr w:type="spellEnd"/>
-            <w:r>
-              <w:rPr>
-                <w:rFonts w:ascii="Source Sans Pro" w:hAnsi="Source Sans Pro"/>
-                <w:b/>
-                <w:bCs/>
-                <w:sz w:val="40"/>
-                <w:szCs w:val="40"/>
-                <w:lang w:val="en-GB"/>
-              </w:rPr>
-              <w:t>&gt;</w:t>
+              <w:t>&lt;Überschrift&gt;</w:t>
             </w:r>
           </w:p>
         </w:tc>
@@ -393,7 +356,6 @@
                 <w:lang w:val="en-GB"/>
               </w:rPr>
             </w:pPr>
-            <w:proofErr w:type="spellStart"/>
             <w:r>
               <w:rPr>
                 <w:rFonts w:ascii="Source Sans Pro" w:hAnsi="Source Sans Pro" w:cs="Arial"/>
@@ -403,7 +365,6 @@
               </w:rPr>
               <w:t>Protokollführer</w:t>
             </w:r>
-            <w:proofErr w:type="spellEnd"/>
           </w:p>
         </w:tc>
         <w:tc>
@@ -426,7 +387,6 @@
                 <w:lang w:val="en-GB"/>
               </w:rPr>
             </w:pPr>
-            <w:proofErr w:type="spellStart"/>
             <w:r>
               <w:rPr>
                 <w:rFonts w:ascii="Source Sans Pro" w:hAnsi="Source Sans Pro" w:cs="Arial"/>
@@ -436,7 +396,6 @@
               </w:rPr>
               <w:t>Unterschrift</w:t>
             </w:r>
-            <w:proofErr w:type="spellEnd"/>
           </w:p>
         </w:tc>
       </w:tr>
@@ -469,7 +428,7 @@
                 <w:rFonts w:cs="Arial"/>
                 <w:lang w:val="en-GB"/>
               </w:rPr>
-              <w:t>2</w:t>
+              <w:t>1</w:t>
             </w:r>
             <w:r>
               <w:rPr>
@@ -625,7 +584,6 @@
                 <w:lang w:val="en-GB"/>
               </w:rPr>
             </w:pPr>
-            <w:proofErr w:type="spellStart"/>
             <w:r>
               <w:rPr>
                 <w:rFonts w:ascii="Source Sans Pro" w:hAnsi="Source Sans Pro" w:cs="Arial"/>
@@ -635,7 +593,6 @@
               </w:rPr>
               <w:t>Unterschrift</w:t>
             </w:r>
-            <w:proofErr w:type="spellEnd"/>
           </w:p>
         </w:tc>
       </w:tr>
@@ -838,7 +795,6 @@
                 <w:lang w:val="en-GB"/>
               </w:rPr>
             </w:pPr>
-            <w:proofErr w:type="spellStart"/>
             <w:r>
               <w:rPr>
                 <w:rFonts w:ascii="Source Sans Pro" w:hAnsi="Source Sans Pro" w:cs="Arial"/>
@@ -848,7 +804,6 @@
               </w:rPr>
               <w:t>Unterschrift</w:t>
             </w:r>
-            <w:proofErr w:type="spellEnd"/>
           </w:p>
         </w:tc>
       </w:tr>
@@ -1041,7 +996,6 @@
                 <w:lang w:val="en-GB"/>
               </w:rPr>
             </w:pPr>
-            <w:proofErr w:type="spellStart"/>
             <w:r>
               <w:rPr>
                 <w:rFonts w:ascii="Source Sans Pro" w:hAnsi="Source Sans Pro" w:cs="Arial"/>
@@ -1051,7 +1005,6 @@
               </w:rPr>
               <w:t>Unterschrift</w:t>
             </w:r>
-            <w:proofErr w:type="spellEnd"/>
           </w:p>
         </w:tc>
       </w:tr>
@@ -1150,7 +1103,6 @@
               <w:jc w:val="center"/>
               <w:rPr>
                 <w:rFonts w:ascii="Source Sans Pro" w:hAnsi="Source Sans Pro" w:cs="Arial"/>
-                <w:lang w:val="en-GB"/>
               </w:rPr>
             </w:pPr>
           </w:p>
@@ -1161,7 +1113,6 @@
               <w:jc w:val="center"/>
               <w:rPr>
                 <w:rFonts w:ascii="Source Sans Pro" w:hAnsi="Source Sans Pro" w:cs="Arial"/>
-                <w:lang w:val="en-GB"/>
               </w:rPr>
             </w:pPr>
           </w:p>
@@ -1175,10 +1126,8 @@
                 <w:bCs/>
                 <w:sz w:val="32"/>
                 <w:szCs w:val="28"/>
-                <w:lang w:val="en-GB"/>
-              </w:rPr>
-            </w:pPr>
-            <w:proofErr w:type="spellStart"/>
+              </w:rPr>
+            </w:pPr>
             <w:r>
               <w:rPr>
                 <w:rFonts w:ascii="Source Sans Pro" w:hAnsi="Source Sans Pro" w:cs="Arial"/>
@@ -1186,82 +1135,36 @@
                 <w:bCs/>
                 <w:sz w:val="32"/>
                 <w:szCs w:val="28"/>
-                <w:lang w:val="en-GB"/>
-              </w:rPr>
-              <w:t>Bauteil</w:t>
-            </w:r>
-            <w:proofErr w:type="spellEnd"/>
-            <w:r>
+              </w:rPr>
+              <w:t>Bauteil das getestet wird:</w:t>
+            </w:r>
+          </w:p>
+          <w:p>
+            <w:pPr>
+              <w:pStyle w:val="TabellenInhalt"/>
+              <w:jc w:val="center"/>
               <w:rPr>
                 <w:rFonts w:ascii="Source Sans Pro" w:hAnsi="Source Sans Pro" w:cs="Arial"/>
                 <w:b/>
                 <w:bCs/>
-                <w:sz w:val="32"/>
-                <w:szCs w:val="28"/>
-                <w:lang w:val="en-GB"/>
-              </w:rPr>
-              <w:t xml:space="preserve"> das </w:t>
-            </w:r>
-            <w:proofErr w:type="spellStart"/>
+              </w:rPr>
+            </w:pPr>
             <w:r>
               <w:rPr>
                 <w:rFonts w:ascii="Source Sans Pro" w:hAnsi="Source Sans Pro" w:cs="Arial"/>
                 <w:b/>
                 <w:bCs/>
-                <w:sz w:val="32"/>
-                <w:szCs w:val="28"/>
-                <w:lang w:val="en-GB"/>
-              </w:rPr>
-              <w:t>getestet</w:t>
-            </w:r>
-            <w:proofErr w:type="spellEnd"/>
+              </w:rPr>
+              <w:t>&lt;B</w:t>
+            </w:r>
             <w:r>
               <w:rPr>
                 <w:rFonts w:ascii="Source Sans Pro" w:hAnsi="Source Sans Pro" w:cs="Arial"/>
                 <w:b/>
                 <w:bCs/>
-                <w:sz w:val="32"/>
-                <w:szCs w:val="28"/>
-                <w:lang w:val="en-GB"/>
-              </w:rPr>
-              <w:t xml:space="preserve"> </w:t>
-            </w:r>
-            <w:proofErr w:type="spellStart"/>
-            <w:r>
-              <w:rPr>
-                <w:rFonts w:ascii="Source Sans Pro" w:hAnsi="Source Sans Pro" w:cs="Arial"/>
-                <w:b/>
-                <w:bCs/>
-                <w:sz w:val="32"/>
-                <w:szCs w:val="28"/>
-                <w:lang w:val="en-GB"/>
-              </w:rPr>
-              <w:t>wird</w:t>
-            </w:r>
-            <w:proofErr w:type="spellEnd"/>
-            <w:r>
-              <w:rPr>
-                <w:rFonts w:ascii="Source Sans Pro" w:hAnsi="Source Sans Pro" w:cs="Arial"/>
-                <w:b/>
-                <w:bCs/>
-                <w:sz w:val="32"/>
-                <w:szCs w:val="28"/>
-                <w:lang w:val="en-GB"/>
-              </w:rPr>
-              <w:t>:</w:t>
-            </w:r>
-          </w:p>
-          <w:p>
-            <w:pPr>
-              <w:pStyle w:val="TabellenInhalt"/>
-              <w:jc w:val="center"/>
-              <w:rPr>
-                <w:rFonts w:ascii="Source Sans Pro" w:hAnsi="Source Sans Pro" w:cs="Arial"/>
-                <w:b/>
-                <w:bCs/>
-                <w:lang w:val="en-GB"/>
-              </w:rPr>
-            </w:pPr>
+              </w:rPr>
+              <w:t>auteil&gt;</w:t>
+            </w:r>
           </w:p>
         </w:tc>
       </w:tr>
@@ -3250,6 +3153,16 @@
 </file>
 
 <file path=customXml/item1.xml><?xml version="1.0" encoding="utf-8"?>
+<p:properties xmlns:p="http://schemas.microsoft.com/office/2006/metadata/properties" xmlns:xsi="http://www.w3.org/2001/XMLSchema-instance" xmlns:pc="http://schemas.microsoft.com/office/infopath/2007/PartnerControls">
+  <documentManagement/>
+</p:properties>
+</file>
+
+<file path=customXml/item2.xml><?xml version="1.0" encoding="utf-8"?>
+<b:Sources xmlns:b="http://schemas.openxmlformats.org/officeDocument/2006/bibliography" xmlns="http://schemas.openxmlformats.org/officeDocument/2006/bibliography" SelectedStyle="\APASixthEditionOfficeOnline.xsl" StyleName="APA" Version="6"/>
+</file>
+
+<file path=customXml/item3.xml><?xml version="1.0" encoding="utf-8"?>
 <ct:contentTypeSchema xmlns:ct="http://schemas.microsoft.com/office/2006/metadata/contentType" xmlns:ma="http://schemas.microsoft.com/office/2006/metadata/properties/metaAttributes" ct:_="" ma:_="" ma:contentTypeName="Dokument" ma:contentTypeID="0x010100AAC9B9A333007144BB4025B22B4CA5CA" ma:contentTypeVersion="5" ma:contentTypeDescription="Ein neues Dokument erstellen." ma:contentTypeScope="" ma:versionID="b3ebcc2f6c8a7591809a19070f7c433b">
   <xsd:schema xmlns:xsd="http://www.w3.org/2001/XMLSchema" xmlns:xs="http://www.w3.org/2001/XMLSchema" xmlns:p="http://schemas.microsoft.com/office/2006/metadata/properties" xmlns:ns2="2b846352-25ec-468b-80b8-1fdb116064f3" xmlns:ns3="bbb8c613-67d8-4c7c-a862-a62c6dc8258b" targetNamespace="http://schemas.microsoft.com/office/2006/metadata/properties" ma:root="true" ma:fieldsID="1e2d70b787a5ad4cb82b612fbdc81050" ns2:_="" ns3:_="">
     <xsd:import namespace="2b846352-25ec-468b-80b8-1fdb116064f3"/>
@@ -3420,16 +3333,6 @@
 </ct:contentTypeSchema>
 </file>
 
-<file path=customXml/item2.xml><?xml version="1.0" encoding="utf-8"?>
-<b:Sources xmlns:b="http://schemas.openxmlformats.org/officeDocument/2006/bibliography" xmlns="http://schemas.openxmlformats.org/officeDocument/2006/bibliography" SelectedStyle="\APASixthEditionOfficeOnline.xsl" StyleName="APA" Version="6"/>
-</file>
-
-<file path=customXml/item3.xml><?xml version="1.0" encoding="utf-8"?>
-<p:properties xmlns:p="http://schemas.microsoft.com/office/2006/metadata/properties" xmlns:xsi="http://www.w3.org/2001/XMLSchema-instance" xmlns:pc="http://schemas.microsoft.com/office/infopath/2007/PartnerControls">
-  <documentManagement/>
-</p:properties>
-</file>
-
 <file path=customXml/item4.xml><?xml version="1.0" encoding="utf-8"?>
 <?mso-contentType ?>
 <FormTemplates xmlns="http://schemas.microsoft.com/sharepoint/v3/contenttype/forms">
@@ -3440,6 +3343,23 @@
 </file>
 
 <file path=customXml/itemProps1.xml><?xml version="1.0" encoding="utf-8"?>
+<ds:datastoreItem xmlns:ds="http://schemas.openxmlformats.org/officeDocument/2006/customXml" ds:itemID="{1866E3AC-DB0B-44B2-A1B9-303232C40AFE}">
+  <ds:schemaRefs>
+    <ds:schemaRef ds:uri="http://schemas.microsoft.com/office/2006/metadata/properties"/>
+    <ds:schemaRef ds:uri="http://schemas.microsoft.com/office/infopath/2007/PartnerControls"/>
+  </ds:schemaRefs>
+</ds:datastoreItem>
+</file>
+
+<file path=customXml/itemProps2.xml><?xml version="1.0" encoding="utf-8"?>
+<ds:datastoreItem xmlns:ds="http://schemas.openxmlformats.org/officeDocument/2006/customXml" ds:itemID="{88CD9F96-CA97-42E5-A87E-2F60F31FEC11}">
+  <ds:schemaRefs>
+    <ds:schemaRef ds:uri="http://schemas.openxmlformats.org/officeDocument/2006/bibliography"/>
+  </ds:schemaRefs>
+</ds:datastoreItem>
+</file>
+
+<file path=customXml/itemProps3.xml><?xml version="1.0" encoding="utf-8"?>
 <ds:datastoreItem xmlns:ds="http://schemas.openxmlformats.org/officeDocument/2006/customXml" ds:itemID="{80C09A88-7488-4958-8AA7-4BAD175CB881}">
   <ds:schemaRefs>
     <ds:schemaRef ds:uri="http://schemas.microsoft.com/office/2006/metadata/contentType"/>
@@ -3458,23 +3378,6 @@
 </ds:datastoreItem>
 </file>
 
-<file path=customXml/itemProps2.xml><?xml version="1.0" encoding="utf-8"?>
-<ds:datastoreItem xmlns:ds="http://schemas.openxmlformats.org/officeDocument/2006/customXml" ds:itemID="{88CD9F96-CA97-42E5-A87E-2F60F31FEC11}">
-  <ds:schemaRefs>
-    <ds:schemaRef ds:uri="http://schemas.openxmlformats.org/officeDocument/2006/bibliography"/>
-  </ds:schemaRefs>
-</ds:datastoreItem>
-</file>
-
-<file path=customXml/itemProps3.xml><?xml version="1.0" encoding="utf-8"?>
-<ds:datastoreItem xmlns:ds="http://schemas.openxmlformats.org/officeDocument/2006/customXml" ds:itemID="{1866E3AC-DB0B-44B2-A1B9-303232C40AFE}">
-  <ds:schemaRefs>
-    <ds:schemaRef ds:uri="http://schemas.microsoft.com/office/2006/metadata/properties"/>
-    <ds:schemaRef ds:uri="http://schemas.microsoft.com/office/infopath/2007/PartnerControls"/>
-  </ds:schemaRefs>
-</ds:datastoreItem>
-</file>
-
 <file path=customXml/itemProps4.xml><?xml version="1.0" encoding="utf-8"?>
 <ds:datastoreItem xmlns:ds="http://schemas.openxmlformats.org/officeDocument/2006/customXml" ds:itemID="{4A1E9AA2-CF86-407C-8C21-CC48297771FB}">
   <ds:schemaRefs>

</xml_diff>

<commit_message>
now automaticly gives in the aactual date in the german template
</commit_message>
<xml_diff>
--- a/vorlage_deutsch.docx
+++ b/vorlage_deutsch.docx
@@ -633,6 +633,13 @@
                 <w:lang w:val="en-GB"/>
               </w:rPr>
               <w:t>Datum</w:t>
+            </w:r>
+            <w:r>
+              <w:rPr>
+                <w:rFonts w:cs="Arial"/>
+                <w:lang w:val="en-GB"/>
+              </w:rPr>
+              <w:t>1</w:t>
             </w:r>
             <w:r>
               <w:rPr>
@@ -3153,16 +3160,6 @@
 </file>
 
 <file path=customXml/item1.xml><?xml version="1.0" encoding="utf-8"?>
-<p:properties xmlns:p="http://schemas.microsoft.com/office/2006/metadata/properties" xmlns:xsi="http://www.w3.org/2001/XMLSchema-instance" xmlns:pc="http://schemas.microsoft.com/office/infopath/2007/PartnerControls">
-  <documentManagement/>
-</p:properties>
-</file>
-
-<file path=customXml/item2.xml><?xml version="1.0" encoding="utf-8"?>
-<b:Sources xmlns:b="http://schemas.openxmlformats.org/officeDocument/2006/bibliography" xmlns="http://schemas.openxmlformats.org/officeDocument/2006/bibliography" SelectedStyle="\APASixthEditionOfficeOnline.xsl" StyleName="APA" Version="6"/>
-</file>
-
-<file path=customXml/item3.xml><?xml version="1.0" encoding="utf-8"?>
 <ct:contentTypeSchema xmlns:ct="http://schemas.microsoft.com/office/2006/metadata/contentType" xmlns:ma="http://schemas.microsoft.com/office/2006/metadata/properties/metaAttributes" ct:_="" ma:_="" ma:contentTypeName="Dokument" ma:contentTypeID="0x010100AAC9B9A333007144BB4025B22B4CA5CA" ma:contentTypeVersion="5" ma:contentTypeDescription="Ein neues Dokument erstellen." ma:contentTypeScope="" ma:versionID="b3ebcc2f6c8a7591809a19070f7c433b">
   <xsd:schema xmlns:xsd="http://www.w3.org/2001/XMLSchema" xmlns:xs="http://www.w3.org/2001/XMLSchema" xmlns:p="http://schemas.microsoft.com/office/2006/metadata/properties" xmlns:ns2="2b846352-25ec-468b-80b8-1fdb116064f3" xmlns:ns3="bbb8c613-67d8-4c7c-a862-a62c6dc8258b" targetNamespace="http://schemas.microsoft.com/office/2006/metadata/properties" ma:root="true" ma:fieldsID="1e2d70b787a5ad4cb82b612fbdc81050" ns2:_="" ns3:_="">
     <xsd:import namespace="2b846352-25ec-468b-80b8-1fdb116064f3"/>
@@ -3333,6 +3330,16 @@
 </ct:contentTypeSchema>
 </file>
 
+<file path=customXml/item2.xml><?xml version="1.0" encoding="utf-8"?>
+<b:Sources xmlns:b="http://schemas.openxmlformats.org/officeDocument/2006/bibliography" xmlns="http://schemas.openxmlformats.org/officeDocument/2006/bibliography" SelectedStyle="\APASixthEditionOfficeOnline.xsl" StyleName="APA" Version="6"/>
+</file>
+
+<file path=customXml/item3.xml><?xml version="1.0" encoding="utf-8"?>
+<p:properties xmlns:p="http://schemas.microsoft.com/office/2006/metadata/properties" xmlns:xsi="http://www.w3.org/2001/XMLSchema-instance" xmlns:pc="http://schemas.microsoft.com/office/infopath/2007/PartnerControls">
+  <documentManagement/>
+</p:properties>
+</file>
+
 <file path=customXml/item4.xml><?xml version="1.0" encoding="utf-8"?>
 <?mso-contentType ?>
 <FormTemplates xmlns="http://schemas.microsoft.com/sharepoint/v3/contenttype/forms">
@@ -3343,23 +3350,6 @@
 </file>
 
 <file path=customXml/itemProps1.xml><?xml version="1.0" encoding="utf-8"?>
-<ds:datastoreItem xmlns:ds="http://schemas.openxmlformats.org/officeDocument/2006/customXml" ds:itemID="{1866E3AC-DB0B-44B2-A1B9-303232C40AFE}">
-  <ds:schemaRefs>
-    <ds:schemaRef ds:uri="http://schemas.microsoft.com/office/2006/metadata/properties"/>
-    <ds:schemaRef ds:uri="http://schemas.microsoft.com/office/infopath/2007/PartnerControls"/>
-  </ds:schemaRefs>
-</ds:datastoreItem>
-</file>
-
-<file path=customXml/itemProps2.xml><?xml version="1.0" encoding="utf-8"?>
-<ds:datastoreItem xmlns:ds="http://schemas.openxmlformats.org/officeDocument/2006/customXml" ds:itemID="{88CD9F96-CA97-42E5-A87E-2F60F31FEC11}">
-  <ds:schemaRefs>
-    <ds:schemaRef ds:uri="http://schemas.openxmlformats.org/officeDocument/2006/bibliography"/>
-  </ds:schemaRefs>
-</ds:datastoreItem>
-</file>
-
-<file path=customXml/itemProps3.xml><?xml version="1.0" encoding="utf-8"?>
 <ds:datastoreItem xmlns:ds="http://schemas.openxmlformats.org/officeDocument/2006/customXml" ds:itemID="{80C09A88-7488-4958-8AA7-4BAD175CB881}">
   <ds:schemaRefs>
     <ds:schemaRef ds:uri="http://schemas.microsoft.com/office/2006/metadata/contentType"/>
@@ -3378,6 +3368,23 @@
 </ds:datastoreItem>
 </file>
 
+<file path=customXml/itemProps2.xml><?xml version="1.0" encoding="utf-8"?>
+<ds:datastoreItem xmlns:ds="http://schemas.openxmlformats.org/officeDocument/2006/customXml" ds:itemID="{88CD9F96-CA97-42E5-A87E-2F60F31FEC11}">
+  <ds:schemaRefs>
+    <ds:schemaRef ds:uri="http://schemas.openxmlformats.org/officeDocument/2006/bibliography"/>
+  </ds:schemaRefs>
+</ds:datastoreItem>
+</file>
+
+<file path=customXml/itemProps3.xml><?xml version="1.0" encoding="utf-8"?>
+<ds:datastoreItem xmlns:ds="http://schemas.openxmlformats.org/officeDocument/2006/customXml" ds:itemID="{1866E3AC-DB0B-44B2-A1B9-303232C40AFE}">
+  <ds:schemaRefs>
+    <ds:schemaRef ds:uri="http://schemas.microsoft.com/office/2006/metadata/properties"/>
+    <ds:schemaRef ds:uri="http://schemas.microsoft.com/office/infopath/2007/PartnerControls"/>
+  </ds:schemaRefs>
+</ds:datastoreItem>
+</file>
+
 <file path=customXml/itemProps4.xml><?xml version="1.0" encoding="utf-8"?>
 <ds:datastoreItem xmlns:ds="http://schemas.openxmlformats.org/officeDocument/2006/customXml" ds:itemID="{4A1E9AA2-CF86-407C-8C21-CC48297771FB}">
   <ds:schemaRefs>

</xml_diff>

<commit_message>
added the potion to to an "abgabedatum" too in german template version
</commit_message>
<xml_diff>
--- a/vorlage_deutsch.docx
+++ b/vorlage_deutsch.docx
@@ -654,6 +654,13 @@
                 <w:lang w:val="en-GB"/>
               </w:rPr>
               <w:t>Datum</w:t>
+            </w:r>
+            <w:r>
+              <w:rPr>
+                <w:rFonts w:cs="Arial"/>
+                <w:lang w:val="en-GB"/>
+              </w:rPr>
+              <w:t>2</w:t>
             </w:r>
             <w:r>
               <w:rPr>
@@ -3160,6 +3167,10 @@
 </file>
 
 <file path=customXml/item1.xml><?xml version="1.0" encoding="utf-8"?>
+<b:Sources xmlns:b="http://schemas.openxmlformats.org/officeDocument/2006/bibliography" xmlns="http://schemas.openxmlformats.org/officeDocument/2006/bibliography" SelectedStyle="\APASixthEditionOfficeOnline.xsl" StyleName="APA" Version="6"/>
+</file>
+
+<file path=customXml/item2.xml><?xml version="1.0" encoding="utf-8"?>
 <ct:contentTypeSchema xmlns:ct="http://schemas.microsoft.com/office/2006/metadata/contentType" xmlns:ma="http://schemas.microsoft.com/office/2006/metadata/properties/metaAttributes" ct:_="" ma:_="" ma:contentTypeName="Dokument" ma:contentTypeID="0x010100AAC9B9A333007144BB4025B22B4CA5CA" ma:contentTypeVersion="5" ma:contentTypeDescription="Ein neues Dokument erstellen." ma:contentTypeScope="" ma:versionID="b3ebcc2f6c8a7591809a19070f7c433b">
   <xsd:schema xmlns:xsd="http://www.w3.org/2001/XMLSchema" xmlns:xs="http://www.w3.org/2001/XMLSchema" xmlns:p="http://schemas.microsoft.com/office/2006/metadata/properties" xmlns:ns2="2b846352-25ec-468b-80b8-1fdb116064f3" xmlns:ns3="bbb8c613-67d8-4c7c-a862-a62c6dc8258b" targetNamespace="http://schemas.microsoft.com/office/2006/metadata/properties" ma:root="true" ma:fieldsID="1e2d70b787a5ad4cb82b612fbdc81050" ns2:_="" ns3:_="">
     <xsd:import namespace="2b846352-25ec-468b-80b8-1fdb116064f3"/>
@@ -3330,17 +3341,7 @@
 </ct:contentTypeSchema>
 </file>
 
-<file path=customXml/item2.xml><?xml version="1.0" encoding="utf-8"?>
-<b:Sources xmlns:b="http://schemas.openxmlformats.org/officeDocument/2006/bibliography" xmlns="http://schemas.openxmlformats.org/officeDocument/2006/bibliography" SelectedStyle="\APASixthEditionOfficeOnline.xsl" StyleName="APA" Version="6"/>
-</file>
-
 <file path=customXml/item3.xml><?xml version="1.0" encoding="utf-8"?>
-<p:properties xmlns:p="http://schemas.microsoft.com/office/2006/metadata/properties" xmlns:xsi="http://www.w3.org/2001/XMLSchema-instance" xmlns:pc="http://schemas.microsoft.com/office/infopath/2007/PartnerControls">
-  <documentManagement/>
-</p:properties>
-</file>
-
-<file path=customXml/item4.xml><?xml version="1.0" encoding="utf-8"?>
 <?mso-contentType ?>
 <FormTemplates xmlns="http://schemas.microsoft.com/sharepoint/v3/contenttype/forms">
   <Display>DocumentLibraryForm</Display>
@@ -3349,7 +3350,21 @@
 </FormTemplates>
 </file>
 
+<file path=customXml/item4.xml><?xml version="1.0" encoding="utf-8"?>
+<p:properties xmlns:p="http://schemas.microsoft.com/office/2006/metadata/properties" xmlns:xsi="http://www.w3.org/2001/XMLSchema-instance" xmlns:pc="http://schemas.microsoft.com/office/infopath/2007/PartnerControls">
+  <documentManagement/>
+</p:properties>
+</file>
+
 <file path=customXml/itemProps1.xml><?xml version="1.0" encoding="utf-8"?>
+<ds:datastoreItem xmlns:ds="http://schemas.openxmlformats.org/officeDocument/2006/customXml" ds:itemID="{88CD9F96-CA97-42E5-A87E-2F60F31FEC11}">
+  <ds:schemaRefs>
+    <ds:schemaRef ds:uri="http://schemas.openxmlformats.org/officeDocument/2006/bibliography"/>
+  </ds:schemaRefs>
+</ds:datastoreItem>
+</file>
+
+<file path=customXml/itemProps2.xml><?xml version="1.0" encoding="utf-8"?>
 <ds:datastoreItem xmlns:ds="http://schemas.openxmlformats.org/officeDocument/2006/customXml" ds:itemID="{80C09A88-7488-4958-8AA7-4BAD175CB881}">
   <ds:schemaRefs>
     <ds:schemaRef ds:uri="http://schemas.microsoft.com/office/2006/metadata/contentType"/>
@@ -3368,27 +3383,19 @@
 </ds:datastoreItem>
 </file>
 
-<file path=customXml/itemProps2.xml><?xml version="1.0" encoding="utf-8"?>
-<ds:datastoreItem xmlns:ds="http://schemas.openxmlformats.org/officeDocument/2006/customXml" ds:itemID="{88CD9F96-CA97-42E5-A87E-2F60F31FEC11}">
+<file path=customXml/itemProps3.xml><?xml version="1.0" encoding="utf-8"?>
+<ds:datastoreItem xmlns:ds="http://schemas.openxmlformats.org/officeDocument/2006/customXml" ds:itemID="{4A1E9AA2-CF86-407C-8C21-CC48297771FB}">
   <ds:schemaRefs>
-    <ds:schemaRef ds:uri="http://schemas.openxmlformats.org/officeDocument/2006/bibliography"/>
+    <ds:schemaRef ds:uri="http://schemas.microsoft.com/sharepoint/v3/contenttype/forms"/>
   </ds:schemaRefs>
 </ds:datastoreItem>
 </file>
 
-<file path=customXml/itemProps3.xml><?xml version="1.0" encoding="utf-8"?>
+<file path=customXml/itemProps4.xml><?xml version="1.0" encoding="utf-8"?>
 <ds:datastoreItem xmlns:ds="http://schemas.openxmlformats.org/officeDocument/2006/customXml" ds:itemID="{1866E3AC-DB0B-44B2-A1B9-303232C40AFE}">
   <ds:schemaRefs>
     <ds:schemaRef ds:uri="http://schemas.microsoft.com/office/2006/metadata/properties"/>
     <ds:schemaRef ds:uri="http://schemas.microsoft.com/office/infopath/2007/PartnerControls"/>
   </ds:schemaRefs>
 </ds:datastoreItem>
-</file>
-
-<file path=customXml/itemProps4.xml><?xml version="1.0" encoding="utf-8"?>
-<ds:datastoreItem xmlns:ds="http://schemas.openxmlformats.org/officeDocument/2006/customXml" ds:itemID="{4A1E9AA2-CF86-407C-8C21-CC48297771FB}">
-  <ds:schemaRefs>
-    <ds:schemaRef ds:uri="http://schemas.microsoft.com/sharepoint/v3/contenttype/forms"/>
-  </ds:schemaRefs>
-</ds:datastoreItem>
 </file>
</xml_diff>